<commit_message>
feat: Introduce a new user and access role management module and add administrative configuration modals to the health flow interface.
</commit_message>
<xml_diff>
--- a/design/CRMv2.docx
+++ b/design/CRMv2.docx
@@ -1,6 +1,6 @@
 
 <file path=word/document.xml><?xml version="1.0" encoding="utf-8"?>
-<w:document xmlns:wpc="http://schemas.microsoft.com/office/word/2010/wordprocessingCanvas" xmlns:cx="http://schemas.microsoft.com/office/drawing/2014/chartex" xmlns:cx1="http://schemas.microsoft.com/office/drawing/2015/9/8/chartex" xmlns:cx2="http://schemas.microsoft.com/office/drawing/2015/10/21/chartex" xmlns:cx3="http://schemas.microsoft.com/office/drawing/2016/5/9/chartex" xmlns:cx4="http://schemas.microsoft.com/office/drawing/2016/5/10/chartex" xmlns:cx5="http://schemas.microsoft.com/office/drawing/2016/5/11/chartex" xmlns:cx6="http://schemas.microsoft.com/office/drawing/2016/5/12/chartex" xmlns:cx7="http://schemas.microsoft.com/office/drawing/2016/5/13/chartex" xmlns:cx8="http://schemas.microsoft.com/office/drawing/2016/5/14/chartex" xmlns:mc="http://schemas.openxmlformats.org/markup-compatibility/2006" xmlns:aink="http://schemas.microsoft.com/office/drawing/2016/ink" xmlns:am3d="http://schemas.microsoft.com/office/drawing/2017/model3d" xmlns:o="urn:schemas-microsoft-com:office:office" xmlns:oel="http://schemas.microsoft.com/office/2019/extlst" xmlns:r="http://schemas.openxmlformats.org/officeDocument/2006/relationships" xmlns:m="http://schemas.openxmlformats.org/officeDocument/2006/math" xmlns:v="urn:schemas-microsoft-com:vml" xmlns:wp14="http://schemas.microsoft.com/office/word/2010/wordprocessingDrawing" xmlns:wp="http://schemas.openxmlformats.org/drawingml/2006/wordprocessingDrawing" xmlns:w10="urn:schemas-microsoft-com:office:word" xmlns:w="http://schemas.openxmlformats.org/wordprocessingml/2006/main" xmlns:w14="http://schemas.microsoft.com/office/word/2010/wordml" xmlns:w15="http://schemas.microsoft.com/office/word/2012/wordml" xmlns:w16cex="http://schemas.microsoft.com/office/word/2018/wordml/cex" xmlns:w16cid="http://schemas.microsoft.com/office/word/2016/wordml/cid" xmlns:w16="http://schemas.microsoft.com/office/word/2018/wordml" xmlns:w16du="http://schemas.microsoft.com/office/word/2023/wordml/word16du" xmlns:w16sdtdh="http://schemas.microsoft.com/office/word/2020/wordml/sdtdatahash" xmlns:w16sdtfl="http://schemas.microsoft.com/office/word/2024/wordml/sdtformatlock" xmlns:w16se="http://schemas.microsoft.com/office/word/2015/wordml/symex" xmlns:wpg="http://schemas.microsoft.com/office/word/2010/wordprocessingGroup" xmlns:wpi="http://schemas.microsoft.com/office/word/2010/wordprocessingInk" xmlns:wne="http://schemas.microsoft.com/office/word/2006/wordml" xmlns:wps="http://schemas.microsoft.com/office/word/2010/wordprocessingShape" mc:Ignorable="w14 w15 w16se w16cid w16 w16cex w16sdtdh w16sdtfl w16du wp14">
+<w:document xmlns:wpc="http://schemas.microsoft.com/office/word/2010/wordprocessingCanvas" xmlns:cx="http://schemas.microsoft.com/office/drawing/2014/chartex" xmlns:cx1="http://schemas.microsoft.com/office/drawing/2015/9/8/chartex" xmlns:cx2="http://schemas.microsoft.com/office/drawing/2015/10/21/chartex" xmlns:cx3="http://schemas.microsoft.com/office/drawing/2016/5/9/chartex" xmlns:cx4="http://schemas.microsoft.com/office/drawing/2016/5/10/chartex" xmlns:cx5="http://schemas.microsoft.com/office/drawing/2016/5/11/chartex" xmlns:cx6="http://schemas.microsoft.com/office/drawing/2016/5/12/chartex" xmlns:cx7="http://schemas.microsoft.com/office/drawing/2016/5/13/chartex" xmlns:cx8="http://schemas.microsoft.com/office/drawing/2016/5/14/chartex" xmlns:mc="http://schemas.openxmlformats.org/markup-compatibility/2006" xmlns:aink="http://schemas.microsoft.com/office/drawing/2016/ink" xmlns:am3d="http://schemas.microsoft.com/office/drawing/2017/model3d" xmlns:o="urn:schemas-microsoft-com:office:office" xmlns:oel="http://schemas.microsoft.com/office/2019/extlst" xmlns:r="http://schemas.openxmlformats.org/officeDocument/2006/relationships" xmlns:m="http://schemas.openxmlformats.org/officeDocument/2006/math" xmlns:v="urn:schemas-microsoft-com:vml" xmlns:wp14="http://schemas.microsoft.com/office/word/2010/wordprocessingDrawing" xmlns:wp="http://schemas.openxmlformats.org/drawingml/2006/wordprocessingDrawing" xmlns:w10="urn:schemas-microsoft-com:office:word" xmlns:w="http://schemas.openxmlformats.org/wordprocessingml/2006/main" xmlns:w14="http://schemas.microsoft.com/office/word/2010/wordml" xmlns:w15="http://schemas.microsoft.com/office/word/2012/wordml" xmlns:w16cex="http://schemas.microsoft.com/office/word/2018/wordml/cex" xmlns:w16cid="http://schemas.microsoft.com/office/word/2016/wordml/cid" xmlns:w16="http://schemas.microsoft.com/office/word/2018/wordml" xmlns:w16sdtdh="http://schemas.microsoft.com/office/word/2020/wordml/sdtdatahash" xmlns:w16se="http://schemas.microsoft.com/office/word/2015/wordml/symex" xmlns:wpg="http://schemas.microsoft.com/office/word/2010/wordprocessingGroup" xmlns:wpi="http://schemas.microsoft.com/office/word/2010/wordprocessingInk" xmlns:wne="http://schemas.microsoft.com/office/word/2006/wordml" xmlns:wps="http://schemas.microsoft.com/office/word/2010/wordprocessingShape" mc:Ignorable="w14 w15 w16se w16cid w16 w16cex w16sdtdh wp14">
   <w:body>
     <w:p>
       <w:pPr>
@@ -148,14 +148,7 @@
           <w:b/>
           <w:bCs/>
         </w:rPr>
-        <w:t xml:space="preserve">caregiver makes booking for new client </w:t>
-      </w:r>
-      <w:r>
-        <w:rPr>
-          <w:b/>
-          <w:bCs/>
-        </w:rPr>
-        <w:t>(process booking through invoicing)</w:t>
+        <w:t>caregiver makes booking for new client (process booking through invoicing)</w:t>
       </w:r>
     </w:p>
     <w:p>
@@ -175,21 +168,7 @@
           <w:b/>
           <w:bCs/>
         </w:rPr>
-        <w:t xml:space="preserve">New Contact – is caregiver makes booking for </w:t>
-      </w:r>
-      <w:r>
-        <w:rPr>
-          <w:b/>
-          <w:bCs/>
-        </w:rPr>
-        <w:t>existing</w:t>
-      </w:r>
-      <w:r>
-        <w:rPr>
-          <w:b/>
-          <w:bCs/>
-        </w:rPr>
-        <w:t xml:space="preserve"> </w:t>
+        <w:t xml:space="preserve">New Contact – is caregiver makes booking for existing </w:t>
       </w:r>
       <w:proofErr w:type="gramStart"/>
       <w:r>
@@ -225,14 +204,7 @@
           <w:b/>
           <w:bCs/>
         </w:rPr>
-        <w:t>Repeat</w:t>
-      </w:r>
-      <w:r>
-        <w:rPr>
-          <w:b/>
-          <w:bCs/>
-        </w:rPr>
-        <w:t xml:space="preserve"> Contact – is caregiver makes booking for existing </w:t>
+        <w:t xml:space="preserve">Repeat Contact – is caregiver makes booking for existing </w:t>
       </w:r>
       <w:proofErr w:type="gramStart"/>
       <w:r>
@@ -268,14 +240,7 @@
           <w:b/>
           <w:bCs/>
         </w:rPr>
-        <w:t xml:space="preserve">New Contact is payer makes booking for existing client </w:t>
-      </w:r>
-      <w:r>
-        <w:rPr>
-          <w:b/>
-          <w:bCs/>
-        </w:rPr>
-        <w:t>(process booking through invoicing)</w:t>
+        <w:t>New Contact is payer makes booking for existing client (process booking through invoicing)</w:t>
       </w:r>
     </w:p>
     <w:p>
@@ -295,14 +260,7 @@
           <w:b/>
           <w:bCs/>
         </w:rPr>
-        <w:t>New Contact – is caregiver makes booking for new client (</w:t>
-      </w:r>
-      <w:r>
-        <w:rPr>
-          <w:b/>
-          <w:bCs/>
-        </w:rPr>
-        <w:t>booking is deferred)</w:t>
+        <w:t>New Contact – is caregiver makes booking for new client (booking is deferred)</w:t>
       </w:r>
     </w:p>
     <w:p>
@@ -322,21 +280,7 @@
           <w:b/>
           <w:bCs/>
         </w:rPr>
-        <w:t xml:space="preserve">New Contact – is caregiver makes booking for new client (booking is </w:t>
-      </w:r>
-      <w:r>
-        <w:rPr>
-          <w:b/>
-          <w:bCs/>
-        </w:rPr>
-        <w:t>cancelled</w:t>
-      </w:r>
-      <w:r>
-        <w:rPr>
-          <w:b/>
-          <w:bCs/>
-        </w:rPr>
-        <w:t>)</w:t>
+        <w:t>New Contact – is caregiver makes booking for new client (booking is cancelled)</w:t>
       </w:r>
     </w:p>
     <w:p>
@@ -450,23 +394,7 @@
           <w:b/>
           <w:bCs/>
         </w:rPr>
-        <w:t xml:space="preserve">is recorded accurately without error </w:t>
-      </w:r>
-      <w:proofErr w:type="gramStart"/>
-      <w:r>
-        <w:rPr>
-          <w:b/>
-          <w:bCs/>
-        </w:rPr>
-        <w:t>message;</w:t>
-      </w:r>
-      <w:proofErr w:type="gramEnd"/>
-      <w:r>
-        <w:rPr>
-          <w:b/>
-          <w:bCs/>
-        </w:rPr>
-        <w:t xml:space="preserve"> </w:t>
+        <w:t xml:space="preserve">is recorded accurately without error message; </w:t>
       </w:r>
     </w:p>
     <w:p>
@@ -687,10 +615,13 @@
     </w:p>
     <w:p>
       <w:r>
+        <w:rPr>
+          <w:noProof/>
+        </w:rPr>
         <w:drawing>
-          <wp:inline distT="0" distB="0" distL="0" distR="0" wp14:anchorId="0D4F7E42" wp14:editId="05FF3AE9">
-            <wp:extent cx="2588260" cy="1887141"/>
-            <wp:effectExtent l="0" t="0" r="2540" b="0"/>
+          <wp:inline distT="0" distB="0" distL="0" distR="0" wp14:anchorId="0D4F7E42" wp14:editId="6FEA2878">
+            <wp:extent cx="4859079" cy="3542831"/>
+            <wp:effectExtent l="0" t="0" r="5080" b="635"/>
             <wp:docPr id="145536438" name="Picture 1" descr="Ron Test 2&#10;&#10;AI-generated content may be incorrect."/>
             <wp:cNvGraphicFramePr>
               <a:graphicFrameLocks xmlns:a="http://schemas.openxmlformats.org/drawingml/2006/main" noChangeAspect="1"/>
@@ -711,7 +642,7 @@
                   <pic:spPr>
                     <a:xfrm>
                       <a:off x="0" y="0"/>
-                      <a:ext cx="2598688" cy="1894744"/>
+                      <a:ext cx="4980832" cy="3631603"/>
                     </a:xfrm>
                     <a:prstGeom prst="rect">
                       <a:avLst/>
@@ -732,6 +663,9 @@
     <w:p/>
     <w:p>
       <w:r>
+        <w:rPr>
+          <w:noProof/>
+        </w:rPr>
         <w:drawing>
           <wp:inline distT="0" distB="0" distL="0" distR="0" wp14:anchorId="7937E0B1" wp14:editId="7A970B57">
             <wp:extent cx="2361903" cy="1415415"/>
@@ -1127,10 +1061,7 @@
         <w:t>(shows details of every VAT Invoice created)</w:t>
       </w:r>
       <w:r>
-        <w:t xml:space="preserve"> Interim Table f</w:t>
-      </w:r>
-      <w:r>
-        <w:t>or validating MISA entries</w:t>
+        <w:t xml:space="preserve"> Interim Table for validating MISA entries</w:t>
       </w:r>
       <w:r>
         <w:t xml:space="preserve"> see </w:t>
@@ -1380,15 +1311,7 @@
         <w:br/>
       </w:r>
       <w:r>
-        <w:t>I cannot see a list of products/</w:t>
-      </w:r>
-      <w:proofErr w:type="gramStart"/>
-      <w:r>
-        <w:t>prices;</w:t>
-      </w:r>
-      <w:proofErr w:type="gramEnd"/>
-      <w:r>
-        <w:t xml:space="preserve"> or pricing rules.  Where are they? </w:t>
+        <w:t xml:space="preserve">I cannot see a list of products/prices; or pricing rules.  Where are they? </w:t>
       </w:r>
     </w:p>
     <w:p>
@@ -1417,15 +1340,7 @@
       </w:r>
       <w:proofErr w:type="gramEnd"/>
       <w:r>
-        <w:t xml:space="preserve"> for custodian to add other </w:t>
-      </w:r>
-      <w:proofErr w:type="gramStart"/>
-      <w:r>
-        <w:t>fields;</w:t>
-      </w:r>
-      <w:proofErr w:type="gramEnd"/>
-      <w:r>
-        <w:t xml:space="preserve"> </w:t>
+        <w:t xml:space="preserve"> for custodian to add other fields; </w:t>
       </w:r>
     </w:p>
     <w:p>
@@ -2149,15 +2064,7 @@
       </w:r>
       <w:r>
         <w:br/>
-        <w:t xml:space="preserve">Select </w:t>
-      </w:r>
-      <w:proofErr w:type="gramStart"/>
-      <w:r>
-        <w:t>Booking  -</w:t>
-      </w:r>
-      <w:proofErr w:type="gramEnd"/>
-      <w:r>
-        <w:t>&gt;</w:t>
+        <w:t>Select Booking  -&gt;</w:t>
       </w:r>
       <w:r>
         <w:br/>
@@ -2340,27 +2247,11 @@
       </w:pPr>
       <w:r>
         <w:lastRenderedPageBreak/>
-        <w:t xml:space="preserve">Note: In Vietnam many people have </w:t>
-      </w:r>
-      <w:proofErr w:type="gramStart"/>
-      <w:r>
-        <w:t>exactly the same</w:t>
-      </w:r>
-      <w:proofErr w:type="gramEnd"/>
-      <w:r>
-        <w:t xml:space="preserve"> name.  When the user is given an option to select a person (client or otherwise) also display the phone number, address national id and any other identifying fields such as tax number.  </w:t>
+        <w:t xml:space="preserve">Note: In Vietnam many people have exactly the same name.  When the user is given an option to select a person (client or otherwise) also display the phone number, address national id and any other identifying fields such as tax number.  </w:t>
       </w:r>
       <w:r>
         <w:br/>
-        <w:t xml:space="preserve">The Address edit works well </w:t>
-      </w:r>
-      <w:proofErr w:type="gramStart"/>
-      <w:r>
-        <w:t>here</w:t>
-      </w:r>
-      <w:proofErr w:type="gramEnd"/>
-      <w:r>
-        <w:t xml:space="preserve"> and it looks good; it does not work everywhere there is an address.  </w:t>
+        <w:t xml:space="preserve">The Address edit works well here and it looks good; it does not work everywhere there is an address.  </w:t>
       </w:r>
     </w:p>
     <w:p>
@@ -3427,9 +3318,10 @@
         <w:rPr>
           <w:b/>
           <w:bCs/>
+          <w:noProof/>
         </w:rPr>
         <w:pict w14:anchorId="5DE12AB7">
-          <v:rect id="_x0000_i1025" style="width:0;height:1.5pt" o:hralign="center" o:hrstd="t" o:hr="t" fillcolor="#a0a0a0" stroked="f"/>
+          <v:rect id="_x0000_i1033" alt="" style="width:415.2pt;height:.05pt;mso-width-percent:0;mso-height-percent:0;mso-width-percent:0;mso-height-percent:0" o:hrpct="920" o:hralign="center" o:hrstd="t" o:hr="t" fillcolor="#a0a0a0" stroked="f"/>
         </w:pict>
       </w:r>
     </w:p>
@@ -3637,9 +3529,10 @@
         <w:rPr>
           <w:b/>
           <w:bCs/>
+          <w:noProof/>
         </w:rPr>
         <w:pict w14:anchorId="223093B6">
-          <v:rect id="_x0000_i1026" style="width:0;height:1.5pt" o:hralign="center" o:hrstd="t" o:hr="t" fillcolor="#a0a0a0" stroked="f"/>
+          <v:rect id="_x0000_i1032" alt="" style="width:415.2pt;height:.05pt;mso-width-percent:0;mso-height-percent:0;mso-width-percent:0;mso-height-percent:0" o:hrpct="920" o:hralign="center" o:hrstd="t" o:hr="t" fillcolor="#a0a0a0" stroked="f"/>
         </w:pict>
       </w:r>
     </w:p>
@@ -3838,9 +3731,10 @@
         <w:rPr>
           <w:b/>
           <w:bCs/>
+          <w:noProof/>
         </w:rPr>
         <w:pict w14:anchorId="3C9F6FCE">
-          <v:rect id="_x0000_i1027" style="width:0;height:1.5pt" o:hralign="center" o:hrstd="t" o:hr="t" fillcolor="#a0a0a0" stroked="f"/>
+          <v:rect id="_x0000_i1031" alt="" style="width:415.2pt;height:.05pt;mso-width-percent:0;mso-height-percent:0;mso-width-percent:0;mso-height-percent:0" o:hrpct="920" o:hralign="center" o:hrstd="t" o:hr="t" fillcolor="#a0a0a0" stroked="f"/>
         </w:pict>
       </w:r>
     </w:p>
@@ -4039,9 +3933,10 @@
         <w:rPr>
           <w:b/>
           <w:bCs/>
+          <w:noProof/>
         </w:rPr>
         <w:pict w14:anchorId="4B90FEA3">
-          <v:rect id="_x0000_i1028" style="width:0;height:1.5pt" o:hralign="center" o:hrstd="t" o:hr="t" fillcolor="#a0a0a0" stroked="f"/>
+          <v:rect id="_x0000_i1030" alt="" style="width:415.2pt;height:.05pt;mso-width-percent:0;mso-height-percent:0;mso-width-percent:0;mso-height-percent:0" o:hrpct="920" o:hralign="center" o:hrstd="t" o:hr="t" fillcolor="#a0a0a0" stroked="f"/>
         </w:pict>
       </w:r>
     </w:p>
@@ -4345,9 +4240,10 @@
         <w:rPr>
           <w:b/>
           <w:bCs/>
+          <w:noProof/>
         </w:rPr>
         <w:pict w14:anchorId="14859406">
-          <v:rect id="_x0000_i1029" style="width:0;height:1.5pt" o:hralign="center" o:hrstd="t" o:hr="t" fillcolor="#a0a0a0" stroked="f"/>
+          <v:rect id="_x0000_i1029" alt="" style="width:415.2pt;height:.05pt;mso-width-percent:0;mso-height-percent:0;mso-width-percent:0;mso-height-percent:0" o:hrpct="920" o:hralign="center" o:hrstd="t" o:hr="t" fillcolor="#a0a0a0" stroked="f"/>
         </w:pict>
       </w:r>
     </w:p>
@@ -4652,9 +4548,10 @@
         <w:rPr>
           <w:b/>
           <w:bCs/>
+          <w:noProof/>
         </w:rPr>
         <w:pict w14:anchorId="638C77BB">
-          <v:rect id="_x0000_i1030" style="width:0;height:1.5pt" o:hralign="center" o:hrstd="t" o:hr="t" fillcolor="#a0a0a0" stroked="f"/>
+          <v:rect id="_x0000_i1028" alt="" style="width:415.2pt;height:.05pt;mso-width-percent:0;mso-height-percent:0;mso-width-percent:0;mso-height-percent:0" o:hrpct="920" o:hralign="center" o:hrstd="t" o:hr="t" fillcolor="#a0a0a0" stroked="f"/>
         </w:pict>
       </w:r>
     </w:p>
@@ -4853,9 +4750,10 @@
         <w:rPr>
           <w:b/>
           <w:bCs/>
+          <w:noProof/>
         </w:rPr>
         <w:pict w14:anchorId="1EDA1AB3">
-          <v:rect id="_x0000_i1031" style="width:0;height:1.5pt" o:hralign="center" o:hrstd="t" o:hr="t" fillcolor="#a0a0a0" stroked="f"/>
+          <v:rect id="_x0000_i1027" alt="" style="width:415.2pt;height:.05pt;mso-width-percent:0;mso-height-percent:0;mso-width-percent:0;mso-height-percent:0" o:hrpct="920" o:hralign="center" o:hrstd="t" o:hr="t" fillcolor="#a0a0a0" stroked="f"/>
         </w:pict>
       </w:r>
     </w:p>
@@ -5054,9 +4952,10 @@
         <w:rPr>
           <w:b/>
           <w:bCs/>
+          <w:noProof/>
         </w:rPr>
         <w:pict w14:anchorId="303F0FBB">
-          <v:rect id="_x0000_i1032" style="width:0;height:1.5pt" o:hralign="center" o:hrstd="t" o:hr="t" fillcolor="#a0a0a0" stroked="f"/>
+          <v:rect id="_x0000_i1026" alt="" style="width:415.2pt;height:.05pt;mso-width-percent:0;mso-height-percent:0;mso-width-percent:0;mso-height-percent:0" o:hrpct="920" o:hralign="center" o:hrstd="t" o:hr="t" fillcolor="#a0a0a0" stroked="f"/>
         </w:pict>
       </w:r>
     </w:p>
@@ -5264,9 +5163,10 @@
         <w:rPr>
           <w:b/>
           <w:bCs/>
+          <w:noProof/>
         </w:rPr>
         <w:pict w14:anchorId="7E4B5671">
-          <v:rect id="_x0000_i1033" style="width:0;height:1.5pt" o:hralign="center" o:hrstd="t" o:hr="t" fillcolor="#a0a0a0" stroked="f"/>
+          <v:rect id="_x0000_i1025" alt="" style="width:415.2pt;height:.05pt;mso-width-percent:0;mso-height-percent:0;mso-width-percent:0;mso-height-percent:0" o:hrpct="920" o:hralign="center" o:hrstd="t" o:hr="t" fillcolor="#a0a0a0" stroked="f"/>
         </w:pict>
       </w:r>
     </w:p>
@@ -5600,6 +5500,7 @@
         <w:rPr>
           <w:b/>
           <w:bCs/>
+          <w:noProof/>
         </w:rPr>
         <w:drawing>
           <wp:inline distT="0" distB="0" distL="0" distR="0" wp14:anchorId="34ACAB7F" wp14:editId="5264B335">
@@ -5670,23 +5571,7 @@
           <w:b/>
           <w:bCs/>
         </w:rPr>
-        <w:t xml:space="preserve"> Note:  Serial Number changes Annually; Invoice number is sequential; Invoice formats should be the </w:t>
-      </w:r>
-      <w:proofErr w:type="gramStart"/>
-      <w:r>
-        <w:rPr>
-          <w:b/>
-          <w:bCs/>
-        </w:rPr>
-        <w:t>same</w:t>
-      </w:r>
-      <w:proofErr w:type="gramEnd"/>
-      <w:r>
-        <w:rPr>
-          <w:b/>
-          <w:bCs/>
-        </w:rPr>
-        <w:t xml:space="preserve"> but Hanoi / HCMC have different address and numbering systems.</w:t>
+        <w:t xml:space="preserve"> Note:  Serial Number changes Annually; Invoice number is sequential; Invoice formats should be the same but Hanoi / HCMC have different address and numbering systems.</w:t>
       </w:r>
     </w:p>
     <w:p>
@@ -5702,6 +5587,7 @@
         <w:rPr>
           <w:b/>
           <w:bCs/>
+          <w:noProof/>
         </w:rPr>
         <w:drawing>
           <wp:inline distT="0" distB="0" distL="0" distR="0" wp14:anchorId="7FCD0BA6" wp14:editId="6346B0F6">
@@ -5751,7 +5637,7 @@
 </file>
 
 <file path=word/numbering.xml><?xml version="1.0" encoding="utf-8"?>
-<w:numbering xmlns:wpc="http://schemas.microsoft.com/office/word/2010/wordprocessingCanvas" xmlns:cx="http://schemas.microsoft.com/office/drawing/2014/chartex" xmlns:cx1="http://schemas.microsoft.com/office/drawing/2015/9/8/chartex" xmlns:cx2="http://schemas.microsoft.com/office/drawing/2015/10/21/chartex" xmlns:cx3="http://schemas.microsoft.com/office/drawing/2016/5/9/chartex" xmlns:cx4="http://schemas.microsoft.com/office/drawing/2016/5/10/chartex" xmlns:cx5="http://schemas.microsoft.com/office/drawing/2016/5/11/chartex" xmlns:cx6="http://schemas.microsoft.com/office/drawing/2016/5/12/chartex" xmlns:cx7="http://schemas.microsoft.com/office/drawing/2016/5/13/chartex" xmlns:cx8="http://schemas.microsoft.com/office/drawing/2016/5/14/chartex" xmlns:mc="http://schemas.openxmlformats.org/markup-compatibility/2006" xmlns:aink="http://schemas.microsoft.com/office/drawing/2016/ink" xmlns:am3d="http://schemas.microsoft.com/office/drawing/2017/model3d" xmlns:o="urn:schemas-microsoft-com:office:office" xmlns:oel="http://schemas.microsoft.com/office/2019/extlst" xmlns:r="http://schemas.openxmlformats.org/officeDocument/2006/relationships" xmlns:m="http://schemas.openxmlformats.org/officeDocument/2006/math" xmlns:v="urn:schemas-microsoft-com:vml" xmlns:wp14="http://schemas.microsoft.com/office/word/2010/wordprocessingDrawing" xmlns:wp="http://schemas.openxmlformats.org/drawingml/2006/wordprocessingDrawing" xmlns:w10="urn:schemas-microsoft-com:office:word" xmlns:w="http://schemas.openxmlformats.org/wordprocessingml/2006/main" xmlns:w14="http://schemas.microsoft.com/office/word/2010/wordml" xmlns:w15="http://schemas.microsoft.com/office/word/2012/wordml" xmlns:w16cex="http://schemas.microsoft.com/office/word/2018/wordml/cex" xmlns:w16cid="http://schemas.microsoft.com/office/word/2016/wordml/cid" xmlns:w16="http://schemas.microsoft.com/office/word/2018/wordml" xmlns:w16du="http://schemas.microsoft.com/office/word/2023/wordml/word16du" xmlns:w16sdtdh="http://schemas.microsoft.com/office/word/2020/wordml/sdtdatahash" xmlns:w16sdtfl="http://schemas.microsoft.com/office/word/2024/wordml/sdtformatlock" xmlns:w16se="http://schemas.microsoft.com/office/word/2015/wordml/symex" xmlns:wpg="http://schemas.microsoft.com/office/word/2010/wordprocessingGroup" xmlns:wpi="http://schemas.microsoft.com/office/word/2010/wordprocessingInk" xmlns:wne="http://schemas.microsoft.com/office/word/2006/wordml" xmlns:wps="http://schemas.microsoft.com/office/word/2010/wordprocessingShape" mc:Ignorable="w14 w15 w16se w16cid w16 w16cex w16sdtdh w16sdtfl w16du wp14">
+<w:numbering xmlns:wpc="http://schemas.microsoft.com/office/word/2010/wordprocessingCanvas" xmlns:cx="http://schemas.microsoft.com/office/drawing/2014/chartex" xmlns:cx1="http://schemas.microsoft.com/office/drawing/2015/9/8/chartex" xmlns:cx2="http://schemas.microsoft.com/office/drawing/2015/10/21/chartex" xmlns:cx3="http://schemas.microsoft.com/office/drawing/2016/5/9/chartex" xmlns:cx4="http://schemas.microsoft.com/office/drawing/2016/5/10/chartex" xmlns:cx5="http://schemas.microsoft.com/office/drawing/2016/5/11/chartex" xmlns:cx6="http://schemas.microsoft.com/office/drawing/2016/5/12/chartex" xmlns:cx7="http://schemas.microsoft.com/office/drawing/2016/5/13/chartex" xmlns:cx8="http://schemas.microsoft.com/office/drawing/2016/5/14/chartex" xmlns:mc="http://schemas.openxmlformats.org/markup-compatibility/2006" xmlns:aink="http://schemas.microsoft.com/office/drawing/2016/ink" xmlns:am3d="http://schemas.microsoft.com/office/drawing/2017/model3d" xmlns:o="urn:schemas-microsoft-com:office:office" xmlns:oel="http://schemas.microsoft.com/office/2019/extlst" xmlns:r="http://schemas.openxmlformats.org/officeDocument/2006/relationships" xmlns:m="http://schemas.openxmlformats.org/officeDocument/2006/math" xmlns:v="urn:schemas-microsoft-com:vml" xmlns:wp14="http://schemas.microsoft.com/office/word/2010/wordprocessingDrawing" xmlns:wp="http://schemas.openxmlformats.org/drawingml/2006/wordprocessingDrawing" xmlns:w10="urn:schemas-microsoft-com:office:word" xmlns:w="http://schemas.openxmlformats.org/wordprocessingml/2006/main" xmlns:w14="http://schemas.microsoft.com/office/word/2010/wordml" xmlns:w15="http://schemas.microsoft.com/office/word/2012/wordml" xmlns:w16cex="http://schemas.microsoft.com/office/word/2018/wordml/cex" xmlns:w16cid="http://schemas.microsoft.com/office/word/2016/wordml/cid" xmlns:w16="http://schemas.microsoft.com/office/word/2018/wordml" xmlns:w16sdtdh="http://schemas.microsoft.com/office/word/2020/wordml/sdtdatahash" xmlns:w16se="http://schemas.microsoft.com/office/word/2015/wordml/symex" xmlns:wpg="http://schemas.microsoft.com/office/word/2010/wordprocessingGroup" xmlns:wpi="http://schemas.microsoft.com/office/word/2010/wordprocessingInk" xmlns:wne="http://schemas.microsoft.com/office/word/2006/wordml" xmlns:wps="http://schemas.microsoft.com/office/word/2010/wordprocessingShape" mc:Ignorable="w14 w15 w16se w16cid w16 w16cex w16sdtdh wp14">
   <w:abstractNum w:abstractNumId="0" w15:restartNumberingAfterBreak="0">
     <w:nsid w:val="1DAC0C4C"/>
     <w:multiLevelType w:val="hybridMultilevel"/>
@@ -6593,7 +6479,7 @@
 </file>
 
 <file path=word/styles.xml><?xml version="1.0" encoding="utf-8"?>
-<w:styles xmlns:mc="http://schemas.openxmlformats.org/markup-compatibility/2006" xmlns:r="http://schemas.openxmlformats.org/officeDocument/2006/relationships" xmlns:w="http://schemas.openxmlformats.org/wordprocessingml/2006/main" xmlns:w14="http://schemas.microsoft.com/office/word/2010/wordml" xmlns:w15="http://schemas.microsoft.com/office/word/2012/wordml" xmlns:w16cex="http://schemas.microsoft.com/office/word/2018/wordml/cex" xmlns:w16cid="http://schemas.microsoft.com/office/word/2016/wordml/cid" xmlns:w16="http://schemas.microsoft.com/office/word/2018/wordml" xmlns:w16du="http://schemas.microsoft.com/office/word/2023/wordml/word16du" xmlns:w16sdtdh="http://schemas.microsoft.com/office/word/2020/wordml/sdtdatahash" xmlns:w16sdtfl="http://schemas.microsoft.com/office/word/2024/wordml/sdtformatlock" xmlns:w16se="http://schemas.microsoft.com/office/word/2015/wordml/symex" mc:Ignorable="w14 w15 w16se w16cid w16 w16cex w16sdtdh w16sdtfl w16du">
+<w:styles xmlns:mc="http://schemas.openxmlformats.org/markup-compatibility/2006" xmlns:r="http://schemas.openxmlformats.org/officeDocument/2006/relationships" xmlns:w="http://schemas.openxmlformats.org/wordprocessingml/2006/main" xmlns:w14="http://schemas.microsoft.com/office/word/2010/wordml" xmlns:w15="http://schemas.microsoft.com/office/word/2012/wordml" xmlns:w16cex="http://schemas.microsoft.com/office/word/2018/wordml/cex" xmlns:w16cid="http://schemas.microsoft.com/office/word/2016/wordml/cid" xmlns:w16="http://schemas.microsoft.com/office/word/2018/wordml" xmlns:w16sdtdh="http://schemas.microsoft.com/office/word/2020/wordml/sdtdatahash" xmlns:w16se="http://schemas.microsoft.com/office/word/2015/wordml/symex" mc:Ignorable="w14 w15 w16se w16cid w16 w16cex w16sdtdh">
   <w:docDefaults>
     <w:rPrDefault>
       <w:rPr>

</xml_diff>

<commit_message>
feat: implement 4-tier visual state system for FSO hub-and-spoke dashboard nodes
</commit_message>
<xml_diff>
--- a/design/CRMv2.docx
+++ b/design/CRMv2.docx
@@ -3321,7 +3321,7 @@
           <w:noProof/>
         </w:rPr>
         <w:pict w14:anchorId="5DE12AB7">
-          <v:rect id="_x0000_i1033" alt="" style="width:415.2pt;height:.05pt;mso-width-percent:0;mso-height-percent:0;mso-width-percent:0;mso-height-percent:0" o:hrpct="920" o:hralign="center" o:hrstd="t" o:hr="t" fillcolor="#a0a0a0" stroked="f"/>
+          <v:rect id="_x0000_i1033" alt="" style="width:382.25pt;height:.05pt;mso-width-percent:0;mso-height-percent:0;mso-width-percent:0;mso-height-percent:0" o:hrpct="847" o:hralign="center" o:hrstd="t" o:hr="t" fillcolor="#a0a0a0" stroked="f"/>
         </w:pict>
       </w:r>
     </w:p>
@@ -3532,7 +3532,7 @@
           <w:noProof/>
         </w:rPr>
         <w:pict w14:anchorId="223093B6">
-          <v:rect id="_x0000_i1032" alt="" style="width:415.2pt;height:.05pt;mso-width-percent:0;mso-height-percent:0;mso-width-percent:0;mso-height-percent:0" o:hrpct="920" o:hralign="center" o:hrstd="t" o:hr="t" fillcolor="#a0a0a0" stroked="f"/>
+          <v:rect id="_x0000_i1032" alt="" style="width:382.25pt;height:.05pt;mso-width-percent:0;mso-height-percent:0;mso-width-percent:0;mso-height-percent:0" o:hrpct="847" o:hralign="center" o:hrstd="t" o:hr="t" fillcolor="#a0a0a0" stroked="f"/>
         </w:pict>
       </w:r>
     </w:p>
@@ -3734,7 +3734,7 @@
           <w:noProof/>
         </w:rPr>
         <w:pict w14:anchorId="3C9F6FCE">
-          <v:rect id="_x0000_i1031" alt="" style="width:415.2pt;height:.05pt;mso-width-percent:0;mso-height-percent:0;mso-width-percent:0;mso-height-percent:0" o:hrpct="920" o:hralign="center" o:hrstd="t" o:hr="t" fillcolor="#a0a0a0" stroked="f"/>
+          <v:rect id="_x0000_i1031" alt="" style="width:382.25pt;height:.05pt;mso-width-percent:0;mso-height-percent:0;mso-width-percent:0;mso-height-percent:0" o:hrpct="847" o:hralign="center" o:hrstd="t" o:hr="t" fillcolor="#a0a0a0" stroked="f"/>
         </w:pict>
       </w:r>
     </w:p>
@@ -3936,7 +3936,7 @@
           <w:noProof/>
         </w:rPr>
         <w:pict w14:anchorId="4B90FEA3">
-          <v:rect id="_x0000_i1030" alt="" style="width:415.2pt;height:.05pt;mso-width-percent:0;mso-height-percent:0;mso-width-percent:0;mso-height-percent:0" o:hrpct="920" o:hralign="center" o:hrstd="t" o:hr="t" fillcolor="#a0a0a0" stroked="f"/>
+          <v:rect id="_x0000_i1030" alt="" style="width:382.25pt;height:.05pt;mso-width-percent:0;mso-height-percent:0;mso-width-percent:0;mso-height-percent:0" o:hrpct="847" o:hralign="center" o:hrstd="t" o:hr="t" fillcolor="#a0a0a0" stroked="f"/>
         </w:pict>
       </w:r>
     </w:p>
@@ -4243,7 +4243,7 @@
           <w:noProof/>
         </w:rPr>
         <w:pict w14:anchorId="14859406">
-          <v:rect id="_x0000_i1029" alt="" style="width:415.2pt;height:.05pt;mso-width-percent:0;mso-height-percent:0;mso-width-percent:0;mso-height-percent:0" o:hrpct="920" o:hralign="center" o:hrstd="t" o:hr="t" fillcolor="#a0a0a0" stroked="f"/>
+          <v:rect id="_x0000_i1029" alt="" style="width:382.25pt;height:.05pt;mso-width-percent:0;mso-height-percent:0;mso-width-percent:0;mso-height-percent:0" o:hrpct="847" o:hralign="center" o:hrstd="t" o:hr="t" fillcolor="#a0a0a0" stroked="f"/>
         </w:pict>
       </w:r>
     </w:p>
@@ -4551,7 +4551,7 @@
           <w:noProof/>
         </w:rPr>
         <w:pict w14:anchorId="638C77BB">
-          <v:rect id="_x0000_i1028" alt="" style="width:415.2pt;height:.05pt;mso-width-percent:0;mso-height-percent:0;mso-width-percent:0;mso-height-percent:0" o:hrpct="920" o:hralign="center" o:hrstd="t" o:hr="t" fillcolor="#a0a0a0" stroked="f"/>
+          <v:rect id="_x0000_i1028" alt="" style="width:382.25pt;height:.05pt;mso-width-percent:0;mso-height-percent:0;mso-width-percent:0;mso-height-percent:0" o:hrpct="847" o:hralign="center" o:hrstd="t" o:hr="t" fillcolor="#a0a0a0" stroked="f"/>
         </w:pict>
       </w:r>
     </w:p>
@@ -4753,7 +4753,7 @@
           <w:noProof/>
         </w:rPr>
         <w:pict w14:anchorId="1EDA1AB3">
-          <v:rect id="_x0000_i1027" alt="" style="width:415.2pt;height:.05pt;mso-width-percent:0;mso-height-percent:0;mso-width-percent:0;mso-height-percent:0" o:hrpct="920" o:hralign="center" o:hrstd="t" o:hr="t" fillcolor="#a0a0a0" stroked="f"/>
+          <v:rect id="_x0000_i1027" alt="" style="width:382.25pt;height:.05pt;mso-width-percent:0;mso-height-percent:0;mso-width-percent:0;mso-height-percent:0" o:hrpct="847" o:hralign="center" o:hrstd="t" o:hr="t" fillcolor="#a0a0a0" stroked="f"/>
         </w:pict>
       </w:r>
     </w:p>
@@ -4955,7 +4955,7 @@
           <w:noProof/>
         </w:rPr>
         <w:pict w14:anchorId="303F0FBB">
-          <v:rect id="_x0000_i1026" alt="" style="width:415.2pt;height:.05pt;mso-width-percent:0;mso-height-percent:0;mso-width-percent:0;mso-height-percent:0" o:hrpct="920" o:hralign="center" o:hrstd="t" o:hr="t" fillcolor="#a0a0a0" stroked="f"/>
+          <v:rect id="_x0000_i1026" alt="" style="width:382.25pt;height:.05pt;mso-width-percent:0;mso-height-percent:0;mso-width-percent:0;mso-height-percent:0" o:hrpct="847" o:hralign="center" o:hrstd="t" o:hr="t" fillcolor="#a0a0a0" stroked="f"/>
         </w:pict>
       </w:r>
     </w:p>
@@ -5166,7 +5166,7 @@
           <w:noProof/>
         </w:rPr>
         <w:pict w14:anchorId="7E4B5671">
-          <v:rect id="_x0000_i1025" alt="" style="width:415.2pt;height:.05pt;mso-width-percent:0;mso-height-percent:0;mso-width-percent:0;mso-height-percent:0" o:hrpct="920" o:hralign="center" o:hrstd="t" o:hr="t" fillcolor="#a0a0a0" stroked="f"/>
+          <v:rect id="_x0000_i1025" alt="" style="width:382.25pt;height:.05pt;mso-width-percent:0;mso-height-percent:0;mso-width-percent:0;mso-height-percent:0" o:hrpct="847" o:hralign="center" o:hrstd="t" o:hr="t" fillcolor="#a0a0a0" stroked="f"/>
         </w:pict>
       </w:r>
     </w:p>

</xml_diff>